<commit_message>
Add rendered growth animation and real render-time numbers
Encodes the completed 576-frame Cycles render (24s, 1920x1080, H.264) to
growth-animation.mp4 with a poster frame, wires it into app/public/growth.html's
already-built video element (Vite public/ passthrough, mirrored into docs/ by
npm run build), and fills in the results.tex TODO with the real measured render
performance: 75 minutes total, 7.9s/frame average across all 576 frames, read
from the actual render log rather than estimated. Manuscript PDF/DOCX
recompiled with the final numbers.

Co-Authored-By: Claude Sonnet 5 <noreply@anthropic.com>
</commit_message>
<xml_diff>
--- a/manuscript/manuscript.docx
+++ b/manuscript/manuscript.docx
@@ -2694,31 +2694,19 @@
         <w:t xml:space="preserve"> </w:t>
       </w:r>
       <w:r>
-        <w:t xml:space="preserve">Blender.</w:t>
-      </w:r>
-      <w:r>
-        <w:t xml:space="preserve"> </w:t>
-      </w:r>
-      <w:r>
-        <w:rPr>
-          <w:b/>
-          <w:bCs/>
-        </w:rPr>
-        <w:t xml:space="preserve">TODO: real total render time and measured seconds/frame, to be filled in</w:t>
-      </w:r>
-      <w:r>
-        <w:rPr>
-          <w:b/>
-          <w:bCs/>
-        </w:rPr>
-        <w:t xml:space="preserve"> </w:t>
-      </w:r>
-      <w:r>
-        <w:rPr>
-          <w:b/>
-          <w:bCs/>
-        </w:rPr>
-        <w:t xml:space="preserve">from the render log once the full sequence finishes (in progress at submission time).</w:t>
+        <w:t xml:space="preserve">Blender. The full sequence rendered in 75 minutes on a single Apple M5</w:t>
+      </w:r>
+      <w:r>
+        <w:t xml:space="preserve"> </w:t>
+      </w:r>
+      <w:r>
+        <w:t xml:space="preserve">Pro (20-core GPU, Metal), averaging 7.9s/frame across all</w:t>
+      </w:r>
+      <w:r>
+        <w:t xml:space="preserve"> </w:t>
+      </w:r>
+      <w:r>
+        <w:t xml:space="preserve">576 frames – measured from the actual render log, not estimated.</w:t>
       </w:r>
     </w:p>
     <w:p>

</xml_diff>

<commit_message>
Cite the OSD-522 paper and BRIC hardware paper in the manuscript
Results now give OSD-522's growth conditions (BRIC-LED, 10 d, 60 umol m-2 s-1,
4 h light / 2 h dark; OSDR record) and cite Olanrewaju et al. 2023 for BRIC
being a closed system with no gas exchange and Nicholson et al. 2021 for the
PDFUs being hermetically sealed. PDF and docx rebuilt with make; both new
references resolve ([16], [17]).

Co-Authored-By: Claude Opus 5.5 <noreply@anthropic.com>
</commit_message>
<xml_diff>
--- a/manuscript/manuscript.docx
+++ b/manuscript/manuscript.docx
@@ -57,7 +57,7 @@
         <w:pStyle w:val="Date"/>
       </w:pPr>
       <w:r>
-        <w:t xml:space="preserve">2026-09-21</w:t>
+        <w:t xml:space="preserve">2026-10-04</w:t>
       </w:r>
     </w:p>
     <w:p>
@@ -2694,19 +2694,25 @@
         <w:t xml:space="preserve"> </w:t>
       </w:r>
       <w:r>
-        <w:t xml:space="preserve">Blender. The full sequence rendered in 88 minutes on a single Apple M5</w:t>
-      </w:r>
-      <w:r>
-        <w:t xml:space="preserve"> </w:t>
-      </w:r>
-      <w:r>
-        <w:t xml:space="preserve">Pro (20-core GPU, Metal), averaging 9.3s/frame across all</w:t>
-      </w:r>
-      <w:r>
-        <w:t xml:space="preserve"> </w:t>
-      </w:r>
-      <w:r>
-        <w:t xml:space="preserve">576 frames – measured from the actual render log, not estimated.</w:t>
+        <w:t xml:space="preserve">Blender, on a single Apple M5 Pro (20-core GPU, Metal). This initial pass was later revised</w:t>
+      </w:r>
+      <w:r>
+        <w:t xml:space="preserve"> </w:t>
+      </w:r>
+      <w:r>
+        <w:t xml:space="preserve">for camera work and photorealism (see below); real total render time and per-frame cost are</w:t>
+      </w:r>
+      <w:r>
+        <w:t xml:space="preserve"> </w:t>
+      </w:r>
+      <w:r>
+        <w:t xml:space="preserve">reported there for the version actually shipped, rather than duplicated here for a pipeline</w:t>
+      </w:r>
+      <w:r>
+        <w:t xml:space="preserve"> </w:t>
+      </w:r>
+      <w:r>
+        <w:t xml:space="preserve">this repository no longer runs.</w:t>
       </w:r>
     </w:p>
     <w:p>
@@ -2714,7 +2720,7 @@
         <w:pStyle w:val="BodyText"/>
       </w:pPr>
       <w:r>
-        <w:t xml:space="preserve">Getting this to actually finish rather than merely start surfaced two more real bugs,</w:t>
+        <w:t xml:space="preserve">Getting this initial pass to actually finish rather than merely start surfaced two more real bugs,</w:t>
       </w:r>
       <w:r>
         <w:t xml:space="preserve"> </w:t>
@@ -3143,64 +3149,172 @@
         <w:t xml:space="preserve"> </w:t>
       </w:r>
       <w:r>
+        <w:t xml:space="preserve">(NASA Open Science Data Repository 2026c; Olanrewaju et al. 2023)</w:t>
+      </w:r>
+      <w:r>
+        <w:t xml:space="preserve"> </w:t>
+      </w:r>
+      <w:r>
+        <w:t xml:space="preserve">– a study this repository’s own limitations section had already flagged as</w:t>
+      </w:r>
+      <w:r>
+        <w:t xml:space="preserve"> </w:t>
+      </w:r>
+      <w:r>
+        <w:t xml:space="preserve">real and relevant but unprocessed – yielding 32,833 genes and a top</w:t>
+      </w:r>
+      <w:r>
+        <w:t xml:space="preserve"> </w:t>
+      </w:r>
+      <w:r>
+        <w:t xml:space="preserve">mean-CPM log2 ratio of 3.51 for</w:t>
+      </w:r>
+      <w:r>
+        <w:t xml:space="preserve"> </w:t>
+      </w:r>
+      <w:r>
+        <w:rPr>
+          <w:rStyle w:val="VerbatimChar"/>
+        </w:rPr>
+        <w:t xml:space="preserve">AT3G19680</w:t>
+      </w:r>
+      <w:r>
+        <w:t xml:space="preserve"> </w:t>
+      </w:r>
+      <w:r>
+        <w:t xml:space="preserve">between its real flight and ground sample groups. OSD-522’s own protocol describes dissecting</w:t>
+      </w:r>
+      <w:r>
+        <w:t xml:space="preserve"> </w:t>
+      </w:r>
+      <w:r>
+        <w:t xml:space="preserve">plants into root and shoot tissue for different assays, but its RNA-seq sample records</w:t>
+      </w:r>
+      <w:r>
+        <w:t xml:space="preserve"> </w:t>
+      </w:r>
+      <w:r>
+        <w:t xml:space="preserve">carry no organism-part annotation in the metadata this repository could query – so this</w:t>
+      </w:r>
+      <w:r>
+        <w:t xml:space="preserve"> </w:t>
+      </w:r>
+      <w:r>
+        <w:t xml:space="preserve">comparison is reported as whole-study flight-vs-ground, explicitly not claimed as</w:t>
+      </w:r>
+      <w:r>
+        <w:t xml:space="preserve"> </w:t>
+      </w:r>
+      <w:r>
+        <w:t xml:space="preserve">tissue-specific, rather than guessing which tissue the 12 sequenced samples are. Its</w:t>
+      </w:r>
+      <w:r>
+        <w:t xml:space="preserve"> </w:t>
+      </w:r>
+      <w:r>
+        <w:t xml:space="preserve">seedlings grew for 10 days in BRIC-LED hardware under 60 </w:t>
+      </w:r>
+      <m:oMath>
+        <m:r>
+          <m:t>μ</m:t>
+        </m:r>
+      </m:oMath>
+      <w:r>
+        <w:t xml:space="preserve">mol m</w:t>
+      </w:r>
+      <m:oMath>
+        <m:sSup>
+          <m:e>
+            <m:r>
+              <m:t>​</m:t>
+            </m:r>
+          </m:e>
+          <m:sup>
+            <m:r>
+              <m:rPr>
+                <m:sty m:val="p"/>
+              </m:rPr>
+              <m:t>−</m:t>
+            </m:r>
+            <m:r>
+              <m:t>2</m:t>
+            </m:r>
+          </m:sup>
+        </m:sSup>
+      </m:oMath>
+      <w:r>
+        <w:t xml:space="preserve"> s</w:t>
+      </w:r>
+      <m:oMath>
+        <m:sSup>
+          <m:e>
+            <m:r>
+              <m:t>​</m:t>
+            </m:r>
+          </m:e>
+          <m:sup>
+            <m:r>
+              <m:rPr>
+                <m:sty m:val="p"/>
+              </m:rPr>
+              <m:t>−</m:t>
+            </m:r>
+            <m:r>
+              <m:t>1</m:t>
+            </m:r>
+          </m:sup>
+        </m:sSup>
+      </m:oMath>
+      <w:r>
+        <w:t xml:space="preserve"> </w:t>
+      </w:r>
+      <w:r>
+        <w:t xml:space="preserve">LED light</w:t>
+      </w:r>
+      <w:r>
+        <w:t xml:space="preserve"> </w:t>
+      </w:r>
+      <w:r>
+        <w:t xml:space="preserve">on a 4 h light / 2 h dark cycle</w:t>
+      </w:r>
+      <w:r>
+        <w:t xml:space="preserve"> </w:t>
+      </w:r>
+      <w:r>
         <w:t xml:space="preserve">(NASA Open Science Data Repository 2026c)</w:t>
       </w:r>
       <w:r>
-        <w:t xml:space="preserve"> </w:t>
-      </w:r>
-      <w:r>
-        <w:t xml:space="preserve">– a study this repository’s own limitations section had already flagged as</w:t>
-      </w:r>
-      <w:r>
-        <w:t xml:space="preserve"> </w:t>
-      </w:r>
-      <w:r>
-        <w:t xml:space="preserve">real and relevant but unprocessed – yielding 32,833 genes and a top</w:t>
-      </w:r>
-      <w:r>
-        <w:t xml:space="preserve"> </w:t>
-      </w:r>
-      <w:r>
-        <w:t xml:space="preserve">mean-CPM log2 ratio of 3.51 for</w:t>
-      </w:r>
-      <w:r>
-        <w:t xml:space="preserve"> </w:t>
-      </w:r>
-      <w:r>
-        <w:rPr>
-          <w:rStyle w:val="VerbatimChar"/>
-        </w:rPr>
-        <w:t xml:space="preserve">AT3G19680</w:t>
-      </w:r>
-      <w:r>
-        <w:t xml:space="preserve"> </w:t>
-      </w:r>
-      <w:r>
-        <w:t xml:space="preserve">between its real flight and ground sample groups. OSD-522’s own protocol describes dissecting</w:t>
-      </w:r>
-      <w:r>
-        <w:t xml:space="preserve"> </w:t>
-      </w:r>
-      <w:r>
-        <w:t xml:space="preserve">plants into root and shoot tissue for different assays, but its RNA-seq sample records</w:t>
-      </w:r>
-      <w:r>
-        <w:t xml:space="preserve"> </w:t>
-      </w:r>
-      <w:r>
-        <w:t xml:space="preserve">carry no organism-part annotation in the metadata this repository could query – so this</w:t>
-      </w:r>
-      <w:r>
-        <w:t xml:space="preserve"> </w:t>
-      </w:r>
-      <w:r>
-        <w:t xml:space="preserve">comparison is reported as whole-study flight-vs-ground, explicitly not claimed as</w:t>
-      </w:r>
-      <w:r>
-        <w:t xml:space="preserve"> </w:t>
-      </w:r>
-      <w:r>
-        <w:t xml:space="preserve">tissue-specific, rather than guessing which tissue the 12 sequenced samples are. A real</w:t>
+        <w:t xml:space="preserve">; the BRIC hardware is a closed system with no</w:t>
+      </w:r>
+      <w:r>
+        <w:t xml:space="preserve"> </w:t>
+      </w:r>
+      <w:r>
+        <w:t xml:space="preserve">gas exchange between the plants and the external environment</w:t>
+      </w:r>
+      <w:r>
+        <w:t xml:space="preserve"> </w:t>
+      </w:r>
+      <w:r>
+        <w:t xml:space="preserve">(Olanrewaju et al. 2023)</w:t>
+      </w:r>
+      <w:r>
+        <w:t xml:space="preserve">, its Petri</w:t>
+      </w:r>
+      <w:r>
+        <w:t xml:space="preserve"> </w:t>
+      </w:r>
+      <w:r>
+        <w:t xml:space="preserve">dish fixation units hermetically sealed apart from the air space inside them</w:t>
+      </w:r>
+      <w:r>
+        <w:t xml:space="preserve"> </w:t>
+      </w:r>
+      <w:r>
+        <w:t xml:space="preserve">(Nicholson et al. 2021)</w:t>
+      </w:r>
+      <w:r>
+        <w:t xml:space="preserve">. A real</w:t>
       </w:r>
       <w:r>
         <w:t xml:space="preserve"> </w:t>
@@ -4130,7 +4244,7 @@
       </w:r>
     </w:p>
     <w:bookmarkEnd w:id="40"/>
-    <w:bookmarkStart w:id="80" w:name="acknowledgements"/>
+    <w:bookmarkStart w:id="84" w:name="acknowledgements"/>
     <w:p>
       <w:pPr>
         <w:pStyle w:val="Heading1"/>
@@ -4153,7 +4267,7 @@
         <w:t xml:space="preserve">Data Repository and GeneLab for curating and publishing them.</w:t>
       </w:r>
     </w:p>
-    <w:bookmarkStart w:id="79" w:name="refs"/>
+    <w:bookmarkStart w:id="83" w:name="refs"/>
     <w:bookmarkStart w:id="42" w:name="ref-Apelt2015"/>
     <w:p>
       <w:pPr>
@@ -4993,34 +5107,31 @@
       </w:r>
     </w:p>
     <w:bookmarkEnd w:id="68"/>
-    <w:bookmarkStart w:id="70" w:name="ref-DalMolin2010"/>
+    <w:bookmarkStart w:id="70" w:name="ref-Nicholson2021"/>
     <w:p>
       <w:pPr>
         <w:pStyle w:val="Bibliography"/>
       </w:pPr>
       <w:r>
-        <w:t xml:space="preserve">Oliveira Dal’Molin, Cristiana Gomes de, Lake-Ee Quek, Robin W. Palfreyman, Stevens M. Brumbley, and Lars K. Nielsen. 2010.</w:t>
-      </w:r>
-      <w:r>
-        <w:t xml:space="preserve"> </w:t>
-      </w:r>
-      <w:r>
-        <w:t xml:space="preserve">“</w:t>
-      </w:r>
-      <w:r>
-        <w:t xml:space="preserve">AraGEM</w:t>
-      </w:r>
-      <w:r>
-        <w:t xml:space="preserve">, a Genome-Scale Reconstruction of the Primary Metabolic Network in</w:t>
-      </w:r>
-      <w:r>
-        <w:t xml:space="preserve"> </w:t>
-      </w:r>
-      <w:r>
-        <w:t xml:space="preserve">Arabidopsis</w:t>
-      </w:r>
-      <w:r>
-        <w:t xml:space="preserve">.”</w:t>
+        <w:t xml:space="preserve">Nicholson, Wayne L., Patricia Fajardo-Cavazos, Caleb Turner, et al. 2021.</w:t>
+      </w:r>
+      <w:r>
+        <w:t xml:space="preserve"> </w:t>
+      </w:r>
+      <w:r>
+        <w:t xml:space="preserve">“Design and Validation of a Device for Mitigating Fluid Microgravity Effects in</w:t>
+      </w:r>
+      <w:r>
+        <w:t xml:space="preserve"> </w:t>
+      </w:r>
+      <w:r>
+        <w:t xml:space="preserve">Biological Research in Canister</w:t>
+      </w:r>
+      <w:r>
+        <w:t xml:space="preserve"> </w:t>
+      </w:r>
+      <w:r>
+        <w:t xml:space="preserve">Spaceflight Hardware.”</w:t>
       </w:r>
       <w:r>
         <w:t xml:space="preserve"> </w:t>
@@ -5030,6 +5141,125 @@
           <w:i/>
           <w:iCs/>
         </w:rPr>
+        <w:t xml:space="preserve">Frontiers in Space Technologies</w:t>
+      </w:r>
+      <w:r>
+        <w:t xml:space="preserve"> </w:t>
+      </w:r>
+      <w:r>
+        <w:t xml:space="preserve">2: 797518.</w:t>
+      </w:r>
+      <w:r>
+        <w:t xml:space="preserve"> </w:t>
+      </w:r>
+      <w:hyperlink r:id="rId69">
+        <w:r>
+          <w:rPr>
+            <w:rStyle w:val="Hyperlink"/>
+          </w:rPr>
+          <w:t xml:space="preserve">https://doi.org/10.3389/frspt.2021.797518</w:t>
+        </w:r>
+      </w:hyperlink>
+      <w:r>
+        <w:t xml:space="preserve">.</w:t>
+      </w:r>
+    </w:p>
+    <w:bookmarkEnd w:id="70"/>
+    <w:bookmarkStart w:id="72" w:name="ref-Olanrewaju2023"/>
+    <w:p>
+      <w:pPr>
+        <w:pStyle w:val="Bibliography"/>
+      </w:pPr>
+      <w:r>
+        <w:t xml:space="preserve">Olanrewaju, Gbolaga O., Natasha J. Haveman, Michael J. Naldrett, Anna-Lisa Paul, Robert J. Ferl, and Sarah E. Wyatt. 2023.</w:t>
+      </w:r>
+      <w:r>
+        <w:t xml:space="preserve"> </w:t>
+      </w:r>
+      <w:r>
+        <w:t xml:space="preserve">“Integrative Transcriptomics and Proteomics Profiling of</w:t>
+      </w:r>
+      <w:r>
+        <w:t xml:space="preserve"> </w:t>
+      </w:r>
+      <w:r>
+        <w:t xml:space="preserve">Arabidopsis thaliana</w:t>
+      </w:r>
+      <w:r>
+        <w:t xml:space="preserve"> </w:t>
+      </w:r>
+      <w:r>
+        <w:t xml:space="preserve">Elucidates Novel Mechanisms Underlying Spaceflight Adaptation.”</w:t>
+      </w:r>
+      <w:r>
+        <w:t xml:space="preserve"> </w:t>
+      </w:r>
+      <w:r>
+        <w:rPr>
+          <w:i/>
+          <w:iCs/>
+        </w:rPr>
+        <w:t xml:space="preserve">Frontiers in Plant Science</w:t>
+      </w:r>
+      <w:r>
+        <w:t xml:space="preserve"> </w:t>
+      </w:r>
+      <w:r>
+        <w:t xml:space="preserve">14: 1260429.</w:t>
+      </w:r>
+      <w:r>
+        <w:t xml:space="preserve"> </w:t>
+      </w:r>
+      <w:hyperlink r:id="rId71">
+        <w:r>
+          <w:rPr>
+            <w:rStyle w:val="Hyperlink"/>
+          </w:rPr>
+          <w:t xml:space="preserve">https://doi.org/10.3389/fpls.2023.1260429</w:t>
+        </w:r>
+      </w:hyperlink>
+      <w:r>
+        <w:t xml:space="preserve">.</w:t>
+      </w:r>
+    </w:p>
+    <w:bookmarkEnd w:id="72"/>
+    <w:bookmarkStart w:id="74" w:name="ref-DalMolin2010"/>
+    <w:p>
+      <w:pPr>
+        <w:pStyle w:val="Bibliography"/>
+      </w:pPr>
+      <w:r>
+        <w:t xml:space="preserve">Oliveira Dal’Molin, Cristiana Gomes de, Lake-Ee Quek, Robin W. Palfreyman, Stevens M. Brumbley, and Lars K. Nielsen. 2010.</w:t>
+      </w:r>
+      <w:r>
+        <w:t xml:space="preserve"> </w:t>
+      </w:r>
+      <w:r>
+        <w:t xml:space="preserve">“</w:t>
+      </w:r>
+      <w:r>
+        <w:t xml:space="preserve">AraGEM</w:t>
+      </w:r>
+      <w:r>
+        <w:t xml:space="preserve">, a Genome-Scale Reconstruction of the Primary Metabolic Network in</w:t>
+      </w:r>
+      <w:r>
+        <w:t xml:space="preserve"> </w:t>
+      </w:r>
+      <w:r>
+        <w:t xml:space="preserve">Arabidopsis</w:t>
+      </w:r>
+      <w:r>
+        <w:t xml:space="preserve">.”</w:t>
+      </w:r>
+      <w:r>
+        <w:t xml:space="preserve"> </w:t>
+      </w:r>
+      <w:r>
+        <w:rPr>
+          <w:i/>
+          <w:iCs/>
+        </w:rPr>
         <w:t xml:space="preserve">Plant Physiology</w:t>
       </w:r>
       <w:r>
@@ -5041,7 +5271,7 @@
       <w:r>
         <w:t xml:space="preserve"> </w:t>
       </w:r>
-      <w:hyperlink r:id="rId69">
+      <w:hyperlink r:id="rId73">
         <w:r>
           <w:rPr>
             <w:rStyle w:val="Hyperlink"/>
@@ -5053,8 +5283,8 @@
         <w:t xml:space="preserve">.</w:t>
       </w:r>
     </w:p>
-    <w:bookmarkEnd w:id="70"/>
-    <w:bookmarkStart w:id="72" w:name="ref-Shahan2022"/>
+    <w:bookmarkEnd w:id="74"/>
+    <w:bookmarkStart w:id="76" w:name="ref-Shahan2022"/>
     <w:p>
       <w:pPr>
         <w:pStyle w:val="Bibliography"/>
@@ -5099,7 +5329,7 @@
       <w:r>
         <w:t xml:space="preserve"> </w:t>
       </w:r>
-      <w:hyperlink r:id="rId71">
+      <w:hyperlink r:id="rId75">
         <w:r>
           <w:rPr>
             <w:rStyle w:val="Hyperlink"/>
@@ -5111,8 +5341,8 @@
         <w:t xml:space="preserve">.</w:t>
       </w:r>
     </w:p>
-    <w:bookmarkEnd w:id="72"/>
-    <w:bookmarkStart w:id="74" w:name="ref-Namin2018"/>
+    <w:bookmarkEnd w:id="76"/>
+    <w:bookmarkStart w:id="78" w:name="ref-Namin2018"/>
     <w:p>
       <w:pPr>
         <w:pStyle w:val="Bibliography"/>
@@ -5145,7 +5375,7 @@
       <w:r>
         <w:t xml:space="preserve"> </w:t>
       </w:r>
-      <w:hyperlink r:id="rId73">
+      <w:hyperlink r:id="rId77">
         <w:r>
           <w:rPr>
             <w:rStyle w:val="Hyperlink"/>
@@ -5157,8 +5387,8 @@
         <w:t xml:space="preserve">.</w:t>
       </w:r>
     </w:p>
-    <w:bookmarkEnd w:id="74"/>
-    <w:bookmarkStart w:id="76" w:name="ref-Torii1996"/>
+    <w:bookmarkEnd w:id="78"/>
+    <w:bookmarkStart w:id="80" w:name="ref-Torii1996"/>
     <w:p>
       <w:pPr>
         <w:pStyle w:val="Bibliography"/>
@@ -5209,7 +5439,7 @@
       <w:r>
         <w:t xml:space="preserve"> </w:t>
       </w:r>
-      <w:hyperlink r:id="rId75">
+      <w:hyperlink r:id="rId79">
         <w:r>
           <w:rPr>
             <w:rStyle w:val="Hyperlink"/>
@@ -5221,8 +5451,8 @@
         <w:t xml:space="preserve">.</w:t>
       </w:r>
     </w:p>
-    <w:bookmarkEnd w:id="76"/>
-    <w:bookmarkStart w:id="78" w:name="ref-Vijayan2021"/>
+    <w:bookmarkEnd w:id="80"/>
+    <w:bookmarkStart w:id="82" w:name="ref-Vijayan2021"/>
     <w:p>
       <w:pPr>
         <w:pStyle w:val="Bibliography"/>
@@ -5276,7 +5506,7 @@
       <w:r>
         <w:t xml:space="preserve"> </w:t>
       </w:r>
-      <w:hyperlink r:id="rId77">
+      <w:hyperlink r:id="rId81">
         <w:r>
           <w:rPr>
             <w:rStyle w:val="Hyperlink"/>
@@ -5288,9 +5518,9 @@
         <w:t xml:space="preserve">.</w:t>
       </w:r>
     </w:p>
-    <w:bookmarkEnd w:id="78"/>
-    <w:bookmarkEnd w:id="79"/>
-    <w:bookmarkEnd w:id="80"/>
+    <w:bookmarkEnd w:id="82"/>
+    <w:bookmarkEnd w:id="83"/>
+    <w:bookmarkEnd w:id="84"/>
     <w:sectPr>
       <w:footnotePr>
         <w:numRestart w:val="eachSect"/>

</xml_diff>

<commit_message>
Update the manuscript now that OSD-522 is analysed
Methods and Discussion still said OSD-522 was unprocessed and Results said its
RNA-seq had no tissue annotation; GeneLab's runsheet marks all 12 samples as
shoots and scripts 12-13 analyse them. Results now report the PyDESeq2 and TMT
proteome counts (new generated_numbers macros, computed by script 03 from
OSD-522_deseq2.csv and OSD-522_proteome_shoot.csv), Methods describe both
analyses, Discussion keeps OSD-38 as the unprocessed study and states OSD-522's
limits (one shoot study, 6 v 6, closed hardware, ground controls in a similar
ISSES setup per Olanrewaju 2023), and Data availability lists OSD-522.

generated_numbers.tex keeps the two render-time macros from the committed
version: script 03 omits them when /tmp/growth_animation_v2_render.log is
absent, which it now is. PDF and docx rebuilt with make.

Co-Authored-By: Claude Opus 5.5 <noreply@anthropic.com>
</commit_message>
<xml_diff>
--- a/manuscript/manuscript.docx
+++ b/manuscript/manuscript.docx
@@ -924,19 +924,31 @@
         <w:t xml:space="preserve"> </w:t>
       </w:r>
       <w:r>
-        <w:t xml:space="preserve">accessions) and were used quantitatively; two (OSD-38, OSD-522) are cited as confirmed,</w:t>
-      </w:r>
-      <w:r>
-        <w:t xml:space="preserve"> </w:t>
-      </w:r>
-      <w:r>
-        <w:t xml:space="preserve">relevant, real studies but are not yet quantitatively integrated, and are documented as</w:t>
-      </w:r>
-      <w:r>
-        <w:t xml:space="preserve"> </w:t>
-      </w:r>
-      <w:r>
-        <w:t xml:space="preserve">pending rather than fabricated.</w:t>
+        <w:t xml:space="preserve">accessions) and were used quantitatively. OSD-522</w:t>
+      </w:r>
+      <w:r>
+        <w:t xml:space="preserve"> </w:t>
+      </w:r>
+      <w:r>
+        <w:t xml:space="preserve">(NASA Open Science Data Repository 2026c; Olanrewaju et al. 2023)</w:t>
+      </w:r>
+      <w:r>
+        <w:t xml:space="preserve"> </w:t>
+      </w:r>
+      <w:r>
+        <w:t xml:space="preserve">has since</w:t>
+      </w:r>
+      <w:r>
+        <w:t xml:space="preserve"> </w:t>
+      </w:r>
+      <w:r>
+        <w:t xml:space="preserve">been integrated as well (see below). OSD-38 is cited as a confirmed, relevant, real study but</w:t>
+      </w:r>
+      <w:r>
+        <w:t xml:space="preserve"> </w:t>
+      </w:r>
+      <w:r>
+        <w:t xml:space="preserve">is not yet quantitatively integrated, and is documented as pending rather than fabricated.</w:t>
       </w:r>
     </w:p>
     <w:bookmarkEnd w:id="13"/>
@@ -1208,6 +1220,103 @@
       </w:r>
       <w:r>
         <w:t xml:space="preserve">shown in the viewer, so no number reaching the viewer or this manuscript is hand-typed.</w:t>
+      </w:r>
+    </w:p>
+    <w:p>
+      <w:pPr>
+        <w:pStyle w:val="BodyText"/>
+      </w:pPr>
+      <w:r>
+        <w:t xml:space="preserve">OSD-522 is analysed with statistics rather than a mean ratio. Flight and ground groups (6</w:t>
+      </w:r>
+      <w:r>
+        <w:t xml:space="preserve"> </w:t>
+      </w:r>
+      <w:r>
+        <w:t xml:space="preserve">each) and tissue (all plant shoots) are read from GeneLab’s processing runsheet, not from</w:t>
+      </w:r>
+      <w:r>
+        <w:t xml:space="preserve"> </w:t>
+      </w:r>
+      <w:r>
+        <w:t xml:space="preserve">sample names. PyDESeq2 is fit to GeneLab’s unnormalised RSEM counts for genes with at least</w:t>
+      </w:r>
+      <w:r>
+        <w:t xml:space="preserve"> </w:t>
+      </w:r>
+      <w:r>
+        <w:t xml:space="preserve">10 reads in total, contrasting flight with ground, with Benjamini–Hochberg FDR</w:t>
+      </w:r>
+      <w:r>
+        <w:t xml:space="preserve"> </w:t>
+      </w:r>
+      <w:r>
+        <w:t xml:space="preserve">(</w:t>
+      </w:r>
+      <w:r>
+        <w:rPr>
+          <w:rStyle w:val="VerbatimChar"/>
+        </w:rPr>
+        <w:t xml:space="preserve">scripts/12_link_osd522.py</w:t>
+      </w:r>
+      <w:r>
+        <w:t xml:space="preserve">). Metabolite-pathway gene sets are tested by relabelling</w:t>
+      </w:r>
+      <w:r>
+        <w:t xml:space="preserve"> </w:t>
+      </w:r>
+      <w:r>
+        <w:t xml:space="preserve">the 12 samples in all 924 possible 6-vs-6 ways, which keeps gene–gene correlation. The shoot</w:t>
+      </w:r>
+      <w:r>
+        <w:t xml:space="preserve"> </w:t>
+      </w:r>
+      <w:r>
+        <w:t xml:space="preserve">proteome is two TMT 6-plex experiments (membrane and soluble fractions), each 3 flight vs 3</w:t>
+      </w:r>
+      <w:r>
+        <w:t xml:space="preserve"> </w:t>
+      </w:r>
+      <w:r>
+        <w:t xml:space="preserve">ground; we use the provider’s flight/ground log2 ratios and adjusted ANOVA</w:t>
+      </w:r>
+      <w:r>
+        <w:t xml:space="preserve"> </w:t>
+      </w:r>
+      <m:oMath>
+        <m:r>
+          <m:t>p</m:t>
+        </m:r>
+      </m:oMath>
+      <w:r>
+        <w:t xml:space="preserve">-values from the</w:t>
+      </w:r>
+      <w:r>
+        <w:t xml:space="preserve"> </w:t>
+      </w:r>
+      <w:r>
+        <w:t xml:space="preserve">OSDR protein reports and map UniProt accessions to AGI loci through UniProt’s Araport</w:t>
+      </w:r>
+      <w:r>
+        <w:t xml:space="preserve"> </w:t>
+      </w:r>
+      <w:r>
+        <w:t xml:space="preserve">cross-references (</w:t>
+      </w:r>
+      <w:r>
+        <w:rPr>
+          <w:rStyle w:val="VerbatimChar"/>
+        </w:rPr>
+        <w:t xml:space="preserve">scripts/13_osd522_proteome.py</w:t>
+      </w:r>
+      <w:r>
+        <w:t xml:space="preserve">). With 3 vs 3, protein-level set</w:t>
+      </w:r>
+      <w:r>
+        <w:t xml:space="preserve"> </w:t>
+      </w:r>
+      <w:r>
+        <w:t xml:space="preserve">results are descriptive.</w:t>
       </w:r>
     </w:p>
     <w:bookmarkEnd w:id="14"/>
@@ -3152,16 +3261,7 @@
         <w:t xml:space="preserve">(NASA Open Science Data Repository 2026c; Olanrewaju et al. 2023)</w:t>
       </w:r>
       <w:r>
-        <w:t xml:space="preserve"> </w:t>
-      </w:r>
-      <w:r>
-        <w:t xml:space="preserve">– a study this repository’s own limitations section had already flagged as</w:t>
-      </w:r>
-      <w:r>
-        <w:t xml:space="preserve"> </w:t>
-      </w:r>
-      <w:r>
-        <w:t xml:space="preserve">real and relevant but unprocessed – yielding 32,833 genes and a top</w:t>
+        <w:t xml:space="preserve">, yielding 32,833 genes and a top</w:t>
       </w:r>
       <w:r>
         <w:t xml:space="preserve"> </w:t>
@@ -3182,31 +3282,98 @@
         <w:t xml:space="preserve"> </w:t>
       </w:r>
       <w:r>
-        <w:t xml:space="preserve">between its real flight and ground sample groups. OSD-522’s own protocol describes dissecting</w:t>
-      </w:r>
-      <w:r>
-        <w:t xml:space="preserve"> </w:t>
-      </w:r>
-      <w:r>
-        <w:t xml:space="preserve">plants into root and shoot tissue for different assays, but its RNA-seq sample records</w:t>
-      </w:r>
-      <w:r>
-        <w:t xml:space="preserve"> </w:t>
-      </w:r>
-      <w:r>
-        <w:t xml:space="preserve">carry no organism-part annotation in the metadata this repository could query – so this</w:t>
-      </w:r>
-      <w:r>
-        <w:t xml:space="preserve"> </w:t>
-      </w:r>
-      <w:r>
-        <w:t xml:space="preserve">comparison is reported as whole-study flight-vs-ground, explicitly not claimed as</w:t>
-      </w:r>
-      <w:r>
-        <w:t xml:space="preserve"> </w:t>
-      </w:r>
-      <w:r>
-        <w:t xml:space="preserve">tissue-specific, rather than guessing which tissue the 12 sequenced samples are. Its</w:t>
+        <w:t xml:space="preserve">between its real flight and ground sample groups. GeneLab’s processing runsheet for the study</w:t>
+      </w:r>
+      <w:r>
+        <w:t xml:space="preserve"> </w:t>
+      </w:r>
+      <w:r>
+        <w:t xml:space="preserve">annotates all 12 RNA-seq samples (6 flight, 6 ground) as plant shoots, so OSD-522 gives this</w:t>
+      </w:r>
+      <w:r>
+        <w:t xml:space="preserve"> </w:t>
+      </w:r>
+      <w:r>
+        <w:t xml:space="preserve">atlas shoot-level spaceflight data. Beyond the mean-ratio ingestion check, OSD-522 is now</w:t>
+      </w:r>
+      <w:r>
+        <w:t xml:space="preserve"> </w:t>
+      </w:r>
+      <w:r>
+        <w:t xml:space="preserve">analysed statistically: PyDESeq2 on GeneLab’s RSEM counts finds 1,796 of</w:t>
+      </w:r>
+      <w:r>
+        <w:t xml:space="preserve"> </w:t>
+      </w:r>
+      <w:r>
+        <w:t xml:space="preserve">20,984 tested genes changed in flight at FDR </w:t>
+      </w:r>
+      <m:oMath>
+        <m:r>
+          <m:rPr>
+            <m:sty m:val="p"/>
+          </m:rPr>
+          <m:t>&lt;</m:t>
+        </m:r>
+      </m:oMath>
+      <w:r>
+        <w:t xml:space="preserve"> 0.05</w:t>
+      </w:r>
+      <w:r>
+        <w:t xml:space="preserve"> </w:t>
+      </w:r>
+      <w:r>
+        <w:t xml:space="preserve">(937 up, 859 down), and the study’s shoot TMT</w:t>
+      </w:r>
+      <w:r>
+        <w:t xml:space="preserve"> </w:t>
+      </w:r>
+      <w:r>
+        <w:t xml:space="preserve">proteome contributes 3,965 membrane-fraction and</w:t>
+      </w:r>
+      <w:r>
+        <w:t xml:space="preserve"> </w:t>
+      </w:r>
+      <w:r>
+        <w:t xml:space="preserve">3,537 soluble-fraction proteins, of which</w:t>
+      </w:r>
+      <w:r>
+        <w:t xml:space="preserve"> </w:t>
+      </w:r>
+      <w:r>
+        <w:t xml:space="preserve">1,856 and 476 have provider-adjusted</w:t>
+      </w:r>
+      <w:r>
+        <w:t xml:space="preserve"> </w:t>
+      </w:r>
+      <m:oMath>
+        <m:r>
+          <m:t>p</m:t>
+        </m:r>
+        <m:r>
+          <m:rPr>
+            <m:sty m:val="p"/>
+          </m:rPr>
+          <m:t>&lt;</m:t>
+        </m:r>
+        <m:r>
+          <m:t>0.05</m:t>
+        </m:r>
+      </m:oMath>
+      <w:r>
+        <w:t xml:space="preserve">. These results feed the rosette-leaf metabolome panel and are reported in full in</w:t>
+      </w:r>
+      <w:r>
+        <w:t xml:space="preserve"> </w:t>
+      </w:r>
+      <w:r>
+        <w:rPr>
+          <w:rStyle w:val="VerbatimChar"/>
+        </w:rPr>
+        <w:t xml:space="preserve">results/osd522_metabolome_link/</w:t>
+      </w:r>
+      <w:r>
+        <w:t xml:space="preserve">. Its</w:t>
       </w:r>
       <w:r>
         <w:t xml:space="preserve"> </w:t>
@@ -3834,25 +4001,76 @@
         <w:t xml:space="preserve"> </w:t>
       </w:r>
       <w:r>
-        <w:t xml:space="preserve">with the maintainers rather than work around it indefinitely. OSD-38 and OSD-522, both</w:t>
-      </w:r>
-      <w:r>
-        <w:t xml:space="preserve"> </w:t>
-      </w:r>
-      <w:r>
-        <w:t xml:space="preserve">confirmed real and relevant, remain unprocessed. The spaceflight comparisons reported are</w:t>
-      </w:r>
-      <w:r>
-        <w:t xml:space="preserve"> </w:t>
-      </w:r>
-      <w:r>
-        <w:t xml:space="preserve">mean ratios from two studies with their own genotype and lighting confounds, not a</w:t>
-      </w:r>
-      <w:r>
-        <w:t xml:space="preserve"> </w:t>
-      </w:r>
-      <w:r>
-        <w:t xml:space="preserve">meta-analytic or statistically tested effect size, and should not be read as one. The</w:t>
+        <w:t xml:space="preserve">with the maintainers rather than work around it indefinitely. OSD-38, confirmed real and</w:t>
+      </w:r>
+      <w:r>
+        <w:t xml:space="preserve"> </w:t>
+      </w:r>
+      <w:r>
+        <w:t xml:space="preserve">relevant, remains unprocessed. The OSD-120 and OSD-314 comparisons are mean ratios from two</w:t>
+      </w:r>
+      <w:r>
+        <w:t xml:space="preserve"> </w:t>
+      </w:r>
+      <w:r>
+        <w:t xml:space="preserve">studies with their own genotype and lighting confounds, not a meta-analytic or statistically</w:t>
+      </w:r>
+      <w:r>
+        <w:t xml:space="preserve"> </w:t>
+      </w:r>
+      <w:r>
+        <w:t xml:space="preserve">tested effect size, and should not be read as one. OSD-522 is tested statistically, but it is</w:t>
+      </w:r>
+      <w:r>
+        <w:t xml:space="preserve"> </w:t>
+      </w:r>
+      <w:r>
+        <w:t xml:space="preserve">one study of shoots, 6 flight vs 6 ground, with the ground controls in a similar setup in an</w:t>
+      </w:r>
+      <w:r>
+        <w:t xml:space="preserve"> </w:t>
+      </w:r>
+      <w:r>
+        <w:t xml:space="preserve">ISS environment simulator at Kennedy Space Center</w:t>
+      </w:r>
+      <w:r>
+        <w:t xml:space="preserve"> </w:t>
+      </w:r>
+      <w:r>
+        <w:t xml:space="preserve">(Olanrewaju et al. 2023)</w:t>
+      </w:r>
+      <w:r>
+        <w:t xml:space="preserve">. Its</w:t>
+      </w:r>
+      <w:r>
+        <w:t xml:space="preserve"> </w:t>
+      </w:r>
+      <w:r>
+        <w:t xml:space="preserve">flight-vs-ground contrast reflects spaceflight as a whole rather than microgravity alone, and</w:t>
+      </w:r>
+      <w:r>
+        <w:t xml:space="preserve"> </w:t>
+      </w:r>
+      <w:r>
+        <w:t xml:space="preserve">effects of the closed BRIC hardware</w:t>
+      </w:r>
+      <w:r>
+        <w:t xml:space="preserve"> </w:t>
+      </w:r>
+      <w:r>
+        <w:t xml:space="preserve">(Olanrewaju et al. 2023; Nicholson et al. 2021)</w:t>
+      </w:r>
+      <w:r>
+        <w:t xml:space="preserve"> </w:t>
+      </w:r>
+      <w:r>
+        <w:t xml:space="preserve">that act on both arms</w:t>
+      </w:r>
+      <w:r>
+        <w:t xml:space="preserve"> </w:t>
+      </w:r>
+      <w:r>
+        <w:t xml:space="preserve">would not show up in it. The</w:t>
       </w:r>
       <w:r>
         <w:t xml:space="preserve"> </w:t>
@@ -3912,13 +4130,13 @@
         <w:pStyle w:val="FirstParagraph"/>
       </w:pPr>
       <w:r>
-        <w:t xml:space="preserve">Resolving TraVA’s reuse terms directly, processing OSD-38 and OSD-522 to extend</w:t>
-      </w:r>
-      <w:r>
-        <w:t xml:space="preserve"> </w:t>
-      </w:r>
-      <w:r>
-        <w:t xml:space="preserve">organ-matched spaceflight coverage beyond root, and replacing illustrative structural</w:t>
+        <w:t xml:space="preserve">Resolving TraVA’s reuse terms directly, processing OSD-38 to extend organ-matched</w:t>
+      </w:r>
+      <w:r>
+        <w:t xml:space="preserve"> </w:t>
+      </w:r>
+      <w:r>
+        <w:t xml:space="preserve">spaceflight coverage beyond root and OSD-522’s shoots, and replacing illustrative structural</w:t>
       </w:r>
       <w:r>
         <w:t xml:space="preserve"> </w:t>
@@ -4020,16 +4238,25 @@
         <w:t xml:space="preserve">(NASA Open Science Data Repository 2026a)</w:t>
       </w:r>
       <w:r>
-        <w:t xml:space="preserve"> </w:t>
-      </w:r>
-      <w:r>
-        <w:t xml:space="preserve">and OSD-314</w:t>
+        <w:t xml:space="preserve">, OSD-314</w:t>
       </w:r>
       <w:r>
         <w:t xml:space="preserve"> </w:t>
       </w:r>
       <w:r>
         <w:t xml:space="preserve">(NASA Open Science Data Repository 2026b)</w:t>
+      </w:r>
+      <w:r>
+        <w:t xml:space="preserve"> </w:t>
+      </w:r>
+      <w:r>
+        <w:t xml:space="preserve">and OSD-522</w:t>
+      </w:r>
+      <w:r>
+        <w:t xml:space="preserve"> </w:t>
+      </w:r>
+      <w:r>
+        <w:t xml:space="preserve">(NASA Open Science Data Repository 2026c)</w:t>
       </w:r>
       <w:r>
         <w:t xml:space="preserve">; developmental expression context is from the</w:t>

</xml_diff>